<commit_message>
chore(sofia-pre-F3): housekeeping pre-cross-project-sync · arrastre la-sync histórico CORE v2.7.3 → v2.7.16 + 2 SKILL.md untracked · D-S04-F3-Q7-Q8 Q8=α · coord SOFIA-CORE 3191fa6 B0.8 pull-back
</commit_message>
<xml_diff>
--- a/docs/takeover/BASELINE-DOCUMENT-v1.0.docx
+++ b/docs/takeover/BASELINE-DOCUMENT-v1.0.docx
@@ -120,12 +120,6 @@
         <w:gridCol w:w="3402"/>
       </w:tblGrid>
       <w:tr>
-        <w:tblPrEx>
-          <w:tblCellMar>
-            <w:top w:w="0" w:type="dxa"/>
-            <w:bottom w:w="0" w:type="dxa"/>
-          </w:tblCellMar>
-        </w:tblPrEx>
         <w:trPr>
           <w:jc w:val="center"/>
         </w:trPr>
@@ -189,12 +183,6 @@
         </w:tc>
       </w:tr>
       <w:tr>
-        <w:tblPrEx>
-          <w:tblCellMar>
-            <w:top w:w="0" w:type="dxa"/>
-            <w:bottom w:w="0" w:type="dxa"/>
-          </w:tblCellMar>
-        </w:tblPrEx>
         <w:trPr>
           <w:jc w:val="center"/>
         </w:trPr>
@@ -265,12 +253,6 @@
         </w:tc>
       </w:tr>
       <w:tr>
-        <w:tblPrEx>
-          <w:tblCellMar>
-            <w:top w:w="0" w:type="dxa"/>
-            <w:bottom w:w="0" w:type="dxa"/>
-          </w:tblCellMar>
-        </w:tblPrEx>
         <w:trPr>
           <w:jc w:val="center"/>
         </w:trPr>
@@ -350,12 +332,6 @@
         </w:tc>
       </w:tr>
       <w:tr>
-        <w:tblPrEx>
-          <w:tblCellMar>
-            <w:top w:w="0" w:type="dxa"/>
-            <w:bottom w:w="0" w:type="dxa"/>
-          </w:tblCellMar>
-        </w:tblPrEx>
         <w:trPr>
           <w:jc w:val="center"/>
         </w:trPr>
@@ -428,12 +404,6 @@
         </w:tc>
       </w:tr>
       <w:tr>
-        <w:tblPrEx>
-          <w:tblCellMar>
-            <w:top w:w="0" w:type="dxa"/>
-            <w:bottom w:w="0" w:type="dxa"/>
-          </w:tblCellMar>
-        </w:tblPrEx>
         <w:trPr>
           <w:jc w:val="center"/>
         </w:trPr>
@@ -497,12 +467,6 @@
         </w:tc>
       </w:tr>
       <w:tr>
-        <w:tblPrEx>
-          <w:tblCellMar>
-            <w:top w:w="0" w:type="dxa"/>
-            <w:bottom w:w="0" w:type="dxa"/>
-          </w:tblCellMar>
-        </w:tblPrEx>
         <w:trPr>
           <w:jc w:val="center"/>
         </w:trPr>
@@ -969,12 +933,6 @@
         <w:gridCol w:w="1804"/>
       </w:tblGrid>
       <w:tr>
-        <w:tblPrEx>
-          <w:tblCellMar>
-            <w:top w:w="0" w:type="dxa"/>
-            <w:bottom w:w="0" w:type="dxa"/>
-          </w:tblCellMar>
-        </w:tblPrEx>
         <w:tc>
           <w:tcPr>
             <w:tcW w:w="1900" w:type="dxa"/>
@@ -1137,12 +1095,6 @@
         </w:tc>
       </w:tr>
       <w:tr>
-        <w:tblPrEx>
-          <w:tblCellMar>
-            <w:top w:w="0" w:type="dxa"/>
-            <w:bottom w:w="0" w:type="dxa"/>
-          </w:tblCellMar>
-        </w:tblPrEx>
         <w:tc>
           <w:tcPr>
             <w:tcW w:w="1900" w:type="dxa"/>
@@ -1317,12 +1269,6 @@
         </w:tc>
       </w:tr>
       <w:tr>
-        <w:tblPrEx>
-          <w:tblCellMar>
-            <w:top w:w="0" w:type="dxa"/>
-            <w:bottom w:w="0" w:type="dxa"/>
-          </w:tblCellMar>
-        </w:tblPrEx>
         <w:tc>
           <w:tcPr>
             <w:tcW w:w="1900" w:type="dxa"/>
@@ -1483,12 +1429,6 @@
         </w:tc>
       </w:tr>
       <w:tr>
-        <w:tblPrEx>
-          <w:tblCellMar>
-            <w:top w:w="0" w:type="dxa"/>
-            <w:bottom w:w="0" w:type="dxa"/>
-          </w:tblCellMar>
-        </w:tblPrEx>
         <w:tc>
           <w:tcPr>
             <w:tcW w:w="1900" w:type="dxa"/>
@@ -1636,12 +1576,6 @@
         </w:tc>
       </w:tr>
       <w:tr>
-        <w:tblPrEx>
-          <w:tblCellMar>
-            <w:top w:w="0" w:type="dxa"/>
-            <w:bottom w:w="0" w:type="dxa"/>
-          </w:tblCellMar>
-        </w:tblPrEx>
         <w:tc>
           <w:tcPr>
             <w:tcW w:w="1900" w:type="dxa"/>
@@ -1905,12 +1839,6 @@
         <w:gridCol w:w="2784"/>
       </w:tblGrid>
       <w:tr>
-        <w:tblPrEx>
-          <w:tblCellMar>
-            <w:top w:w="0" w:type="dxa"/>
-            <w:bottom w:w="0" w:type="dxa"/>
-          </w:tblCellMar>
-        </w:tblPrEx>
         <w:tc>
           <w:tcPr>
             <w:tcW w:w="2400" w:type="dxa"/>
@@ -2073,12 +2001,6 @@
         </w:tc>
       </w:tr>
       <w:tr>
-        <w:tblPrEx>
-          <w:tblCellMar>
-            <w:top w:w="0" w:type="dxa"/>
-            <w:bottom w:w="0" w:type="dxa"/>
-          </w:tblCellMar>
-        </w:tblPrEx>
         <w:tc>
           <w:tcPr>
             <w:tcW w:w="2400" w:type="dxa"/>
@@ -2227,12 +2149,6 @@
         </w:tc>
       </w:tr>
       <w:tr>
-        <w:tblPrEx>
-          <w:tblCellMar>
-            <w:top w:w="0" w:type="dxa"/>
-            <w:bottom w:w="0" w:type="dxa"/>
-          </w:tblCellMar>
-        </w:tblPrEx>
         <w:tc>
           <w:tcPr>
             <w:tcW w:w="2400" w:type="dxa"/>
@@ -2392,12 +2308,6 @@
         </w:tc>
       </w:tr>
       <w:tr>
-        <w:tblPrEx>
-          <w:tblCellMar>
-            <w:top w:w="0" w:type="dxa"/>
-            <w:bottom w:w="0" w:type="dxa"/>
-          </w:tblCellMar>
-        </w:tblPrEx>
         <w:tc>
           <w:tcPr>
             <w:tcW w:w="2400" w:type="dxa"/>
@@ -2590,12 +2500,6 @@
         <w:gridCol w:w="1609"/>
       </w:tblGrid>
       <w:tr>
-        <w:tblPrEx>
-          <w:tblCellMar>
-            <w:top w:w="0" w:type="dxa"/>
-            <w:bottom w:w="0" w:type="dxa"/>
-          </w:tblCellMar>
-        </w:tblPrEx>
         <w:tc>
           <w:tcPr>
             <w:tcW w:w="2800" w:type="dxa"/>
@@ -2758,12 +2662,6 @@
         </w:tc>
       </w:tr>
       <w:tr>
-        <w:tblPrEx>
-          <w:tblCellMar>
-            <w:top w:w="0" w:type="dxa"/>
-            <w:bottom w:w="0" w:type="dxa"/>
-          </w:tblCellMar>
-        </w:tblPrEx>
         <w:tc>
           <w:tcPr>
             <w:tcW w:w="2800" w:type="dxa"/>
@@ -2915,12 +2813,6 @@
         </w:tc>
       </w:tr>
       <w:tr>
-        <w:tblPrEx>
-          <w:tblCellMar>
-            <w:top w:w="0" w:type="dxa"/>
-            <w:bottom w:w="0" w:type="dxa"/>
-          </w:tblCellMar>
-        </w:tblPrEx>
         <w:tc>
           <w:tcPr>
             <w:tcW w:w="2800" w:type="dxa"/>
@@ -3072,12 +2964,6 @@
         </w:tc>
       </w:tr>
       <w:tr>
-        <w:tblPrEx>
-          <w:tblCellMar>
-            <w:top w:w="0" w:type="dxa"/>
-            <w:bottom w:w="0" w:type="dxa"/>
-          </w:tblCellMar>
-        </w:tblPrEx>
         <w:tc>
           <w:tcPr>
             <w:tcW w:w="2800" w:type="dxa"/>
@@ -3229,12 +3115,6 @@
         </w:tc>
       </w:tr>
       <w:tr>
-        <w:tblPrEx>
-          <w:tblCellMar>
-            <w:top w:w="0" w:type="dxa"/>
-            <w:bottom w:w="0" w:type="dxa"/>
-          </w:tblCellMar>
-        </w:tblPrEx>
         <w:tc>
           <w:tcPr>
             <w:tcW w:w="2800" w:type="dxa"/>
@@ -3430,12 +3310,6 @@
         <w:gridCol w:w="4004"/>
       </w:tblGrid>
       <w:tr>
-        <w:tblPrEx>
-          <w:tblCellMar>
-            <w:top w:w="0" w:type="dxa"/>
-            <w:bottom w:w="0" w:type="dxa"/>
-          </w:tblCellMar>
-        </w:tblPrEx>
         <w:tc>
           <w:tcPr>
             <w:tcW w:w="2600" w:type="dxa"/>
@@ -3535,12 +3409,6 @@
         </w:tc>
       </w:tr>
       <w:tr>
-        <w:tblPrEx>
-          <w:tblCellMar>
-            <w:top w:w="0" w:type="dxa"/>
-            <w:bottom w:w="0" w:type="dxa"/>
-          </w:tblCellMar>
-        </w:tblPrEx>
         <w:tc>
           <w:tcPr>
             <w:tcW w:w="2600" w:type="dxa"/>
@@ -3626,12 +3494,6 @@
         </w:tc>
       </w:tr>
       <w:tr>
-        <w:tblPrEx>
-          <w:tblCellMar>
-            <w:top w:w="0" w:type="dxa"/>
-            <w:bottom w:w="0" w:type="dxa"/>
-          </w:tblCellMar>
-        </w:tblPrEx>
         <w:tc>
           <w:tcPr>
             <w:tcW w:w="2600" w:type="dxa"/>
@@ -3717,12 +3579,6 @@
         </w:tc>
       </w:tr>
       <w:tr>
-        <w:tblPrEx>
-          <w:tblCellMar>
-            <w:top w:w="0" w:type="dxa"/>
-            <w:bottom w:w="0" w:type="dxa"/>
-          </w:tblCellMar>
-        </w:tblPrEx>
         <w:tc>
           <w:tcPr>
             <w:tcW w:w="2600" w:type="dxa"/>
@@ -3808,12 +3664,6 @@
         </w:tc>
       </w:tr>
       <w:tr>
-        <w:tblPrEx>
-          <w:tblCellMar>
-            <w:top w:w="0" w:type="dxa"/>
-            <w:bottom w:w="0" w:type="dxa"/>
-          </w:tblCellMar>
-        </w:tblPrEx>
         <w:tc>
           <w:tcPr>
             <w:tcW w:w="2600" w:type="dxa"/>
@@ -4045,12 +3895,6 @@
         <w:gridCol w:w="3291"/>
       </w:tblGrid>
       <w:tr>
-        <w:tblPrEx>
-          <w:tblCellMar>
-            <w:top w:w="0" w:type="dxa"/>
-            <w:bottom w:w="0" w:type="dxa"/>
-          </w:tblCellMar>
-        </w:tblPrEx>
         <w:tc>
           <w:tcPr>
             <w:tcW w:w="1000" w:type="dxa"/>
@@ -4213,12 +4057,6 @@
         </w:tc>
       </w:tr>
       <w:tr>
-        <w:tblPrEx>
-          <w:tblCellMar>
-            <w:top w:w="0" w:type="dxa"/>
-            <w:bottom w:w="0" w:type="dxa"/>
-          </w:tblCellMar>
-        </w:tblPrEx>
         <w:tc>
           <w:tcPr>
             <w:tcW w:w="1000" w:type="dxa"/>
@@ -4372,12 +4210,6 @@
         </w:tc>
       </w:tr>
       <w:tr>
-        <w:tblPrEx>
-          <w:tblCellMar>
-            <w:top w:w="0" w:type="dxa"/>
-            <w:bottom w:w="0" w:type="dxa"/>
-          </w:tblCellMar>
-        </w:tblPrEx>
         <w:tc>
           <w:tcPr>
             <w:tcW w:w="1000" w:type="dxa"/>
@@ -4563,12 +4395,6 @@
         </w:tc>
       </w:tr>
       <w:tr>
-        <w:tblPrEx>
-          <w:tblCellMar>
-            <w:top w:w="0" w:type="dxa"/>
-            <w:bottom w:w="0" w:type="dxa"/>
-          </w:tblCellMar>
-        </w:tblPrEx>
         <w:tc>
           <w:tcPr>
             <w:tcW w:w="1000" w:type="dxa"/>
@@ -4745,12 +4571,6 @@
         </w:tc>
       </w:tr>
       <w:tr>
-        <w:tblPrEx>
-          <w:tblCellMar>
-            <w:top w:w="0" w:type="dxa"/>
-            <w:bottom w:w="0" w:type="dxa"/>
-          </w:tblCellMar>
-        </w:tblPrEx>
         <w:tc>
           <w:tcPr>
             <w:tcW w:w="1000" w:type="dxa"/>
@@ -4929,12 +4749,6 @@
         </w:tc>
       </w:tr>
       <w:tr>
-        <w:tblPrEx>
-          <w:tblCellMar>
-            <w:top w:w="0" w:type="dxa"/>
-            <w:bottom w:w="0" w:type="dxa"/>
-          </w:tblCellMar>
-        </w:tblPrEx>
         <w:tc>
           <w:tcPr>
             <w:tcW w:w="1000" w:type="dxa"/>
@@ -5185,12 +4999,6 @@
         <w:gridCol w:w="3504"/>
       </w:tblGrid>
       <w:tr>
-        <w:tblPrEx>
-          <w:tblCellMar>
-            <w:top w:w="0" w:type="dxa"/>
-            <w:bottom w:w="0" w:type="dxa"/>
-          </w:tblCellMar>
-        </w:tblPrEx>
         <w:tc>
           <w:tcPr>
             <w:tcW w:w="3000" w:type="dxa"/>
@@ -5289,12 +5097,6 @@
         </w:tc>
       </w:tr>
       <w:tr>
-        <w:tblPrEx>
-          <w:tblCellMar>
-            <w:top w:w="0" w:type="dxa"/>
-            <w:bottom w:w="0" w:type="dxa"/>
-          </w:tblCellMar>
-        </w:tblPrEx>
         <w:tc>
           <w:tcPr>
             <w:tcW w:w="3000" w:type="dxa"/>
@@ -5397,12 +5199,6 @@
         </w:tc>
       </w:tr>
       <w:tr>
-        <w:tblPrEx>
-          <w:tblCellMar>
-            <w:top w:w="0" w:type="dxa"/>
-            <w:bottom w:w="0" w:type="dxa"/>
-          </w:tblCellMar>
-        </w:tblPrEx>
         <w:tc>
           <w:tcPr>
             <w:tcW w:w="3000" w:type="dxa"/>
@@ -5496,12 +5292,6 @@
         </w:tc>
       </w:tr>
       <w:tr>
-        <w:tblPrEx>
-          <w:tblCellMar>
-            <w:top w:w="0" w:type="dxa"/>
-            <w:bottom w:w="0" w:type="dxa"/>
-          </w:tblCellMar>
-        </w:tblPrEx>
         <w:tc>
           <w:tcPr>
             <w:tcW w:w="3000" w:type="dxa"/>
@@ -5597,12 +5387,6 @@
         </w:tc>
       </w:tr>
       <w:tr>
-        <w:tblPrEx>
-          <w:tblCellMar>
-            <w:top w:w="0" w:type="dxa"/>
-            <w:bottom w:w="0" w:type="dxa"/>
-          </w:tblCellMar>
-        </w:tblPrEx>
         <w:tc>
           <w:tcPr>
             <w:tcW w:w="3000" w:type="dxa"/>
@@ -5712,12 +5496,6 @@
         </w:tc>
       </w:tr>
       <w:tr>
-        <w:tblPrEx>
-          <w:tblCellMar>
-            <w:top w:w="0" w:type="dxa"/>
-            <w:bottom w:w="0" w:type="dxa"/>
-          </w:tblCellMar>
-        </w:tblPrEx>
         <w:tc>
           <w:tcPr>
             <w:tcW w:w="3000" w:type="dxa"/>
@@ -5859,12 +5637,6 @@
         <w:gridCol w:w="1672"/>
       </w:tblGrid>
       <w:tr>
-        <w:tblPrEx>
-          <w:tblCellMar>
-            <w:top w:w="0" w:type="dxa"/>
-            <w:bottom w:w="0" w:type="dxa"/>
-          </w:tblCellMar>
-        </w:tblPrEx>
         <w:tc>
           <w:tcPr>
             <w:tcW w:w="2400" w:type="dxa"/>
@@ -6027,12 +5799,6 @@
         </w:tc>
       </w:tr>
       <w:tr>
-        <w:tblPrEx>
-          <w:tblCellMar>
-            <w:top w:w="0" w:type="dxa"/>
-            <w:bottom w:w="0" w:type="dxa"/>
-          </w:tblCellMar>
-        </w:tblPrEx>
         <w:tc>
           <w:tcPr>
             <w:tcW w:w="2400" w:type="dxa"/>
@@ -6199,12 +5965,6 @@
         </w:tc>
       </w:tr>
       <w:tr>
-        <w:tblPrEx>
-          <w:tblCellMar>
-            <w:top w:w="0" w:type="dxa"/>
-            <w:bottom w:w="0" w:type="dxa"/>
-          </w:tblCellMar>
-        </w:tblPrEx>
         <w:tc>
           <w:tcPr>
             <w:tcW w:w="2400" w:type="dxa"/>
@@ -6344,12 +6104,6 @@
         </w:tc>
       </w:tr>
       <w:tr>
-        <w:tblPrEx>
-          <w:tblCellMar>
-            <w:top w:w="0" w:type="dxa"/>
-            <w:bottom w:w="0" w:type="dxa"/>
-          </w:tblCellMar>
-        </w:tblPrEx>
         <w:tc>
           <w:tcPr>
             <w:tcW w:w="2400" w:type="dxa"/>
@@ -6586,12 +6340,6 @@
         <w:gridCol w:w="3004"/>
       </w:tblGrid>
       <w:tr>
-        <w:tblPrEx>
-          <w:tblCellMar>
-            <w:top w:w="0" w:type="dxa"/>
-            <w:bottom w:w="0" w:type="dxa"/>
-          </w:tblCellMar>
-        </w:tblPrEx>
         <w:tc>
           <w:tcPr>
             <w:tcW w:w="1000" w:type="dxa"/>
@@ -6721,12 +6469,6 @@
         </w:tc>
       </w:tr>
       <w:tr>
-        <w:tblPrEx>
-          <w:tblCellMar>
-            <w:top w:w="0" w:type="dxa"/>
-            <w:bottom w:w="0" w:type="dxa"/>
-          </w:tblCellMar>
-        </w:tblPrEx>
         <w:tc>
           <w:tcPr>
             <w:tcW w:w="1000" w:type="dxa"/>
@@ -6810,12 +6552,6 @@
         </w:tc>
       </w:tr>
       <w:tr>
-        <w:tblPrEx>
-          <w:tblCellMar>
-            <w:top w:w="0" w:type="dxa"/>
-            <w:bottom w:w="0" w:type="dxa"/>
-          </w:tblCellMar>
-        </w:tblPrEx>
         <w:tc>
           <w:tcPr>
             <w:tcW w:w="1000" w:type="dxa"/>
@@ -6899,12 +6635,6 @@
         </w:tc>
       </w:tr>
       <w:tr>
-        <w:tblPrEx>
-          <w:tblCellMar>
-            <w:top w:w="0" w:type="dxa"/>
-            <w:bottom w:w="0" w:type="dxa"/>
-          </w:tblCellMar>
-        </w:tblPrEx>
         <w:tc>
           <w:tcPr>
             <w:tcW w:w="1000" w:type="dxa"/>
@@ -7113,12 +6843,6 @@
         <w:gridCol w:w="1804"/>
       </w:tblGrid>
       <w:tr>
-        <w:tblPrEx>
-          <w:tblCellMar>
-            <w:top w:w="0" w:type="dxa"/>
-            <w:bottom w:w="0" w:type="dxa"/>
-          </w:tblCellMar>
-        </w:tblPrEx>
         <w:tc>
           <w:tcPr>
             <w:tcW w:w="900" w:type="dxa"/>
@@ -7251,12 +6975,6 @@
         </w:tc>
       </w:tr>
       <w:tr>
-        <w:tblPrEx>
-          <w:tblCellMar>
-            <w:top w:w="0" w:type="dxa"/>
-            <w:bottom w:w="0" w:type="dxa"/>
-          </w:tblCellMar>
-        </w:tblPrEx>
         <w:tc>
           <w:tcPr>
             <w:tcW w:w="900" w:type="dxa"/>
@@ -7392,12 +7110,6 @@
         </w:tc>
       </w:tr>
       <w:tr>
-        <w:tblPrEx>
-          <w:tblCellMar>
-            <w:top w:w="0" w:type="dxa"/>
-            <w:bottom w:w="0" w:type="dxa"/>
-          </w:tblCellMar>
-        </w:tblPrEx>
         <w:tc>
           <w:tcPr>
             <w:tcW w:w="900" w:type="dxa"/>
@@ -7535,12 +7247,6 @@
         </w:tc>
       </w:tr>
       <w:tr>
-        <w:tblPrEx>
-          <w:tblCellMar>
-            <w:top w:w="0" w:type="dxa"/>
-            <w:bottom w:w="0" w:type="dxa"/>
-          </w:tblCellMar>
-        </w:tblPrEx>
         <w:tc>
           <w:tcPr>
             <w:tcW w:w="900" w:type="dxa"/>
@@ -7663,12 +7369,6 @@
         </w:tc>
       </w:tr>
       <w:tr>
-        <w:tblPrEx>
-          <w:tblCellMar>
-            <w:top w:w="0" w:type="dxa"/>
-            <w:bottom w:w="0" w:type="dxa"/>
-          </w:tblCellMar>
-        </w:tblPrEx>
         <w:tc>
           <w:tcPr>
             <w:tcW w:w="900" w:type="dxa"/>
@@ -7807,12 +7507,6 @@
         </w:tc>
       </w:tr>
       <w:tr>
-        <w:tblPrEx>
-          <w:tblCellMar>
-            <w:top w:w="0" w:type="dxa"/>
-            <w:bottom w:w="0" w:type="dxa"/>
-          </w:tblCellMar>
-        </w:tblPrEx>
         <w:tc>
           <w:tcPr>
             <w:tcW w:w="900" w:type="dxa"/>
@@ -7958,12 +7652,6 @@
         </w:tc>
       </w:tr>
       <w:tr>
-        <w:tblPrEx>
-          <w:tblCellMar>
-            <w:top w:w="0" w:type="dxa"/>
-            <w:bottom w:w="0" w:type="dxa"/>
-          </w:tblCellMar>
-        </w:tblPrEx>
         <w:tc>
           <w:tcPr>
             <w:tcW w:w="900" w:type="dxa"/>
@@ -8110,12 +7798,6 @@
         </w:tc>
       </w:tr>
       <w:tr>
-        <w:tblPrEx>
-          <w:tblCellMar>
-            <w:top w:w="0" w:type="dxa"/>
-            <w:bottom w:w="0" w:type="dxa"/>
-          </w:tblCellMar>
-        </w:tblPrEx>
         <w:tc>
           <w:tcPr>
             <w:tcW w:w="900" w:type="dxa"/>
@@ -8286,12 +7968,6 @@
         </w:tc>
       </w:tr>
       <w:tr>
-        <w:tblPrEx>
-          <w:tblCellMar>
-            <w:top w:w="0" w:type="dxa"/>
-            <w:bottom w:w="0" w:type="dxa"/>
-          </w:tblCellMar>
-        </w:tblPrEx>
         <w:tc>
           <w:tcPr>
             <w:tcW w:w="900" w:type="dxa"/>
@@ -8458,12 +8134,6 @@
         <w:gridCol w:w="3404"/>
       </w:tblGrid>
       <w:tr>
-        <w:tblPrEx>
-          <w:tblCellMar>
-            <w:top w:w="0" w:type="dxa"/>
-            <w:bottom w:w="0" w:type="dxa"/>
-          </w:tblCellMar>
-        </w:tblPrEx>
         <w:tc>
           <w:tcPr>
             <w:tcW w:w="900" w:type="dxa"/>
@@ -8594,12 +8264,6 @@
         </w:tc>
       </w:tr>
       <w:tr>
-        <w:tblPrEx>
-          <w:tblCellMar>
-            <w:top w:w="0" w:type="dxa"/>
-            <w:bottom w:w="0" w:type="dxa"/>
-          </w:tblCellMar>
-        </w:tblPrEx>
         <w:tc>
           <w:tcPr>
             <w:tcW w:w="900" w:type="dxa"/>
@@ -8717,12 +8381,6 @@
         </w:tc>
       </w:tr>
       <w:tr>
-        <w:tblPrEx>
-          <w:tblCellMar>
-            <w:top w:w="0" w:type="dxa"/>
-            <w:bottom w:w="0" w:type="dxa"/>
-          </w:tblCellMar>
-        </w:tblPrEx>
         <w:tc>
           <w:tcPr>
             <w:tcW w:w="900" w:type="dxa"/>
@@ -8847,12 +8505,6 @@
         </w:tc>
       </w:tr>
       <w:tr>
-        <w:tblPrEx>
-          <w:tblCellMar>
-            <w:top w:w="0" w:type="dxa"/>
-            <w:bottom w:w="0" w:type="dxa"/>
-          </w:tblCellMar>
-        </w:tblPrEx>
         <w:tc>
           <w:tcPr>
             <w:tcW w:w="900" w:type="dxa"/>
@@ -8997,12 +8649,6 @@
         </w:tc>
       </w:tr>
       <w:tr>
-        <w:tblPrEx>
-          <w:tblCellMar>
-            <w:top w:w="0" w:type="dxa"/>
-            <w:bottom w:w="0" w:type="dxa"/>
-          </w:tblCellMar>
-        </w:tblPrEx>
         <w:tc>
           <w:tcPr>
             <w:tcW w:w="900" w:type="dxa"/>
@@ -9776,12 +9422,6 @@
         <w:gridCol w:w="1904"/>
       </w:tblGrid>
       <w:tr>
-        <w:tblPrEx>
-          <w:tblCellMar>
-            <w:top w:w="0" w:type="dxa"/>
-            <w:bottom w:w="0" w:type="dxa"/>
-          </w:tblCellMar>
-        </w:tblPrEx>
         <w:tc>
           <w:tcPr>
             <w:tcW w:w="500" w:type="dxa"/>
@@ -9913,12 +9553,6 @@
         </w:tc>
       </w:tr>
       <w:tr>
-        <w:tblPrEx>
-          <w:tblCellMar>
-            <w:top w:w="0" w:type="dxa"/>
-            <w:bottom w:w="0" w:type="dxa"/>
-          </w:tblCellMar>
-        </w:tblPrEx>
         <w:tc>
           <w:tcPr>
             <w:tcW w:w="500" w:type="dxa"/>
@@ -10074,12 +9708,6 @@
         </w:tc>
       </w:tr>
       <w:tr>
-        <w:tblPrEx>
-          <w:tblCellMar>
-            <w:top w:w="0" w:type="dxa"/>
-            <w:bottom w:w="0" w:type="dxa"/>
-          </w:tblCellMar>
-        </w:tblPrEx>
         <w:tc>
           <w:tcPr>
             <w:tcW w:w="500" w:type="dxa"/>
@@ -10215,12 +9843,6 @@
         </w:tc>
       </w:tr>
       <w:tr>
-        <w:tblPrEx>
-          <w:tblCellMar>
-            <w:top w:w="0" w:type="dxa"/>
-            <w:bottom w:w="0" w:type="dxa"/>
-          </w:tblCellMar>
-        </w:tblPrEx>
         <w:tc>
           <w:tcPr>
             <w:tcW w:w="500" w:type="dxa"/>
@@ -10336,12 +9958,6 @@
         </w:tc>
       </w:tr>
       <w:tr>
-        <w:tblPrEx>
-          <w:tblCellMar>
-            <w:top w:w="0" w:type="dxa"/>
-            <w:bottom w:w="0" w:type="dxa"/>
-          </w:tblCellMar>
-        </w:tblPrEx>
         <w:tc>
           <w:tcPr>
             <w:tcW w:w="500" w:type="dxa"/>
@@ -10749,12 +10365,6 @@
         <w:gridCol w:w="4052"/>
       </w:tblGrid>
       <w:tr>
-        <w:tblPrEx>
-          <w:tblCellMar>
-            <w:top w:w="0" w:type="dxa"/>
-            <w:bottom w:w="0" w:type="dxa"/>
-          </w:tblCellMar>
-        </w:tblPrEx>
         <w:tc>
           <w:tcPr>
             <w:tcW w:w="4052" w:type="dxa"/>

</xml_diff>